<commit_message>
기능: 접근 교통(F-24) data/access.ts + /tools/access 화면 완료
인천→생장피드포르 경로 4개(파리·비아리츠·팜플로나 성수기/비수기)를
가이드북·예매 사이트 출처로 조사해 데이터화하고, 무료 도구 4번째로
화면까지 완성했다(ToolNav·sitemap 연결).

- schema.ts AccessRoute에 source·checkedAt 필드 추가(RouteVariant와
  동일 패턴). 인천→비아리츠·팜플로나는 직항이 없어 경유편을 지어내지
  않고 durationMin/costEur를 null로 남김.
- estimatedCostKrw 중 유럽 내 기차·버스 요금(직접 검색 확인)과
  인천↔유럽 항공권 몫(기존 추정치 활용, 재검색 안 함)을 코드 주석과
  화면 고지로 명확히 구분 — 출처 정직성 보완.
- 이어서작업.md를 오늘 세션 전체(Phase 2 게이트 재해석, forks.ts,
  access.ts, 06 문서 백엔드 아키텍처 등) 반영해 재작성.

npm run build → 182페이지, tsc·eslint·vitest(30/30) 전부 통과.

Co-Authored-By: Claude Sonnet 5 <noreply@anthropic.com>
</commit_message>
<xml_diff>
--- a/docs/docx/00_README.docx
+++ b/docs/docx/00_README.docx
@@ -22,7 +22,7 @@
         <w:t xml:space="preserve"> </w:t>
       </w:r>
       <w:r>
-        <w:t xml:space="preserve">문서 v6.13 · 2026년 7월</w:t>
+        <w:t xml:space="preserve">문서 v6.15 · 2026년 7월</w:t>
       </w:r>
     </w:p>
     <w:p>
@@ -7575,6 +7575,229 @@
             </w:r>
             <w:r>
               <w:t xml:space="preserve">— 필드 테스터(어차피 갈 예정인 순례자) 모집이라는 대안을 05 문서 6.0절에 신설. CLAUDE.md·00·05·이어서작업.md 반영</w:t>
+            </w:r>
+          </w:p>
+        </w:tc>
+      </w:tr>
+      <w:tr>
+        <w:tc>
+          <w:tcPr/>
+          <w:p>
+            <w:pPr>
+              <w:pStyle w:val="Compact"/>
+            </w:pPr>
+            <w:r>
+              <w:rPr>
+                <w:b/>
+                <w:bCs/>
+              </w:rPr>
+              <w:t xml:space="preserve">v6.14</w:t>
+            </w:r>
+          </w:p>
+        </w:tc>
+        <w:tc>
+          <w:tcPr/>
+          <w:p>
+            <w:pPr>
+              <w:pStyle w:val="Compact"/>
+            </w:pPr>
+            <w:r>
+              <w:rPr>
+                <w:rStyle w:val="VerbatimChar"/>
+                <w:b/>
+                <w:bCs/>
+              </w:rPr>
+              <w:t xml:space="preserve">data/access.ts</w:t>
+            </w:r>
+            <w:r>
+              <w:rPr>
+                <w:b/>
+                <w:bCs/>
+              </w:rPr>
+              <w:t xml:space="preserve"> </w:t>
+            </w:r>
+            <w:r>
+              <w:rPr>
+                <w:b/>
+                <w:bCs/>
+              </w:rPr>
+              <w:t xml:space="preserve">신설(F-24 접근 교통, 4개 경로: 파리·비아리츠·팜플로나 성수기/비수기).</w:t>
+            </w:r>
+            <w:r>
+              <w:t xml:space="preserve"> </w:t>
+            </w:r>
+            <w:r>
+              <w:t xml:space="preserve">정정된 Phase 2 조건(v6.13) 이후 첫 착수 항목. 가이드북 출처(</w:t>
+            </w:r>
+            <w:r>
+              <w:rPr>
+                <w:rStyle w:val="VerbatimChar"/>
+              </w:rPr>
+              <w:t xml:space="preserve">source: 'GUIDEBOOK'</w:t>
+            </w:r>
+            <w:r>
+              <w:t xml:space="preserve">,</w:t>
+            </w:r>
+            <w:r>
+              <w:t xml:space="preserve"> </w:t>
+            </w:r>
+            <w:r>
+              <w:rPr>
+                <w:rStyle w:val="VerbatimChar"/>
+              </w:rPr>
+              <w:t xml:space="preserve">checkedAt: '2026-07'</w:t>
+            </w:r>
+            <w:r>
+              <w:t xml:space="preserve">), 인천→비아리츠·팜플로나는 직항이 없어 경유편을 지어내지 않고 null로 남김. schema.ts</w:t>
+            </w:r>
+            <w:r>
+              <w:t xml:space="preserve"> </w:t>
+            </w:r>
+            <w:r>
+              <w:rPr>
+                <w:rStyle w:val="VerbatimChar"/>
+              </w:rPr>
+              <w:t xml:space="preserve">AccessRoute</w:t>
+            </w:r>
+            <w:r>
+              <w:t xml:space="preserve">에</w:t>
+            </w:r>
+            <w:r>
+              <w:t xml:space="preserve"> </w:t>
+            </w:r>
+            <w:r>
+              <w:rPr>
+                <w:rStyle w:val="VerbatimChar"/>
+              </w:rPr>
+              <w:t xml:space="preserve">source</w:t>
+            </w:r>
+            <w:r>
+              <w:t xml:space="preserve">·</w:t>
+            </w:r>
+            <w:r>
+              <w:rPr>
+                <w:rStyle w:val="VerbatimChar"/>
+              </w:rPr>
+              <w:t xml:space="preserve">checkedAt</w:t>
+            </w:r>
+            <w:r>
+              <w:t xml:space="preserve"> </w:t>
+            </w:r>
+            <w:r>
+              <w:t xml:space="preserve">필드 추가. 03 문서가 예전부터 갖고 있던 "CDG 공항 TGV역" 서술을 재검색으로 확인 — 몽파르나스 경유(4시간)가 CDG 직결(6시간반)보다 빠르다는 트레이드오프를 캡션에 반영</w:t>
+            </w:r>
+          </w:p>
+        </w:tc>
+      </w:tr>
+      <w:tr>
+        <w:tc>
+          <w:tcPr/>
+          <w:p>
+            <w:pPr>
+              <w:pStyle w:val="Compact"/>
+            </w:pPr>
+            <w:r>
+              <w:rPr>
+                <w:b/>
+                <w:bCs/>
+              </w:rPr>
+              <w:t xml:space="preserve">v6.15</w:t>
+            </w:r>
+          </w:p>
+        </w:tc>
+        <w:tc>
+          <w:tcPr/>
+          <w:p>
+            <w:pPr>
+              <w:pStyle w:val="Compact"/>
+            </w:pPr>
+            <w:r>
+              <w:rPr>
+                <w:rStyle w:val="VerbatimChar"/>
+                <w:b/>
+                <w:bCs/>
+              </w:rPr>
+              <w:t xml:space="preserve">/tools/access</w:t>
+            </w:r>
+            <w:r>
+              <w:rPr>
+                <w:b/>
+                <w:bCs/>
+              </w:rPr>
+              <w:t xml:space="preserve"> </w:t>
+            </w:r>
+            <w:r>
+              <w:rPr>
+                <w:b/>
+                <w:bCs/>
+              </w:rPr>
+              <w:t xml:space="preserve">화면 신설(무료 도구 4번째) +</w:t>
+            </w:r>
+            <w:r>
+              <w:rPr>
+                <w:b/>
+                <w:bCs/>
+              </w:rPr>
+              <w:t xml:space="preserve"> </w:t>
+            </w:r>
+            <w:r>
+              <w:rPr>
+                <w:rStyle w:val="VerbatimChar"/>
+                <w:b/>
+                <w:bCs/>
+              </w:rPr>
+              <w:t xml:space="preserve">access.ts</w:t>
+            </w:r>
+            <w:r>
+              <w:rPr>
+                <w:b/>
+                <w:bCs/>
+              </w:rPr>
+              <w:t xml:space="preserve"> </w:t>
+            </w:r>
+            <w:r>
+              <w:rPr>
+                <w:b/>
+                <w:bCs/>
+              </w:rPr>
+              <w:t xml:space="preserve">출처 정직성 보완.</w:t>
+            </w:r>
+            <w:r>
+              <w:t xml:space="preserve"> </w:t>
+            </w:r>
+            <w:r>
+              <w:rPr>
+                <w:rStyle w:val="VerbatimChar"/>
+              </w:rPr>
+              <w:t xml:space="preserve">estimatedCostKrw</w:t>
+            </w:r>
+            <w:r>
+              <w:t xml:space="preserve">에 섞여 있던 "직접 검색 확인한 유럽 내 요금"과 "재검색 안 한 항공권 추정치"를 코드 주석으로 명확히 갈랐다. 화면에도 "가이드북 출처, 예약 전 재확인" 고지 표시.</w:t>
+            </w:r>
+            <w:r>
+              <w:t xml:space="preserve"> </w:t>
+            </w:r>
+            <w:r>
+              <w:rPr>
+                <w:rStyle w:val="VerbatimChar"/>
+              </w:rPr>
+              <w:t xml:space="preserve">npm run build</w:t>
+            </w:r>
+            <w:r>
+              <w:t xml:space="preserve"> </w:t>
+            </w:r>
+            <w:r>
+              <w:t xml:space="preserve">→</w:t>
+            </w:r>
+            <w:r>
+              <w:t xml:space="preserve"> </w:t>
+            </w:r>
+            <w:r>
+              <w:rPr>
+                <w:b/>
+                <w:bCs/>
+              </w:rPr>
+              <w:t xml:space="preserve">182페이지</w:t>
             </w:r>
           </w:p>
         </w:tc>

</xml_diff>